<commit_message>
research folder and drone 360 flip sim
</commit_message>
<xml_diff>
--- a/MAMUN RAHMAN .docx
+++ b/MAMUN RAHMAN .docx
@@ -12,7 +12,7 @@
         <mc:AlternateContent>
           <mc:Choice Requires="wpg">
             <w:drawing>
-              <wp:anchor distT="0" distB="0" distL="0" distR="0" simplePos="0" relativeHeight="2" behindDoc="1" locked="0" layoutInCell="0" allowOverlap="1" wp14:anchorId="5D7989B1">
+              <wp:anchor distT="6985" distB="6350" distL="6985" distR="6350" simplePos="0" relativeHeight="2" behindDoc="1" locked="0" layoutInCell="0" allowOverlap="1" wp14:anchorId="5D7989B1">
                 <wp:simplePos x="0" y="0"/>
                 <wp:positionH relativeFrom="page">
                   <wp:posOffset>5490845</wp:posOffset>
@@ -71,9 +71,9 @@
                             <a:avLst/>
                             <a:gdLst>
                               <a:gd name="textAreaLeft" fmla="*/ 0 w 740520"/>
-                              <a:gd name="textAreaRight" fmla="*/ 740880 w 740520"/>
+                              <a:gd name="textAreaRight" fmla="*/ 741960 w 740520"/>
                               <a:gd name="textAreaTop" fmla="*/ 0 h 923400"/>
-                              <a:gd name="textAreaBottom" fmla="*/ 923760 h 923400"/>
+                              <a:gd name="textAreaBottom" fmla="*/ 924840 h 923400"/>
                             </a:gdLst>
                             <a:ahLst/>
                             <a:cxnLst/>
@@ -459,7 +459,13 @@
         </w:rPr>
       </w:pPr>
       <w:r>
-        <w:rPr/>
+        <w:rPr>
+          <w:b w:val="false"/>
+          <w:bCs w:val="false"/>
+          <w:spacing w:val="-2"/>
+          <w:sz w:val="24"/>
+          <w:szCs w:val="24"/>
+        </w:rPr>
       </w:r>
     </w:p>
     <w:p>
@@ -613,15 +619,7 @@
         <w:rPr/>
         <w:t>Designation</w:t>
         <w:tab/>
-        <w:t xml:space="preserve">: </w:t>
-      </w:r>
-      <w:r>
-        <w:rPr/>
-        <w:t>Sr.</w:t>
-      </w:r>
-      <w:r>
-        <w:rPr/>
-        <w:t xml:space="preserve"> Operator</w:t>
+        <w:t>: Operator</w:t>
       </w:r>
     </w:p>
     <w:p>
@@ -639,15 +637,118 @@
         <w:rPr/>
         <w:t>Duration</w:t>
         <w:tab/>
-        <w:t>: 0</w:t>
-      </w:r>
-      <w:r>
-        <w:rPr/>
-        <w:t>2</w:t>
-      </w:r>
-      <w:r>
-        <w:rPr/>
-        <w:t xml:space="preserve"> Year</w:t>
+        <w:t>: 02 Year</w:t>
+      </w:r>
+    </w:p>
+    <w:p>
+      <w:pPr>
+        <w:pStyle w:val="Normal"/>
+        <w:tabs>
+          <w:tab w:val="clear" w:pos="720"/>
+          <w:tab w:val="left" w:pos="2179" w:leader="none"/>
+        </w:tabs>
+        <w:spacing w:lineRule="auto" w:line="410" w:beforeAutospacing="0" w:before="0" w:after="0"/>
+        <w:ind w:hanging="0" w:start="0" w:end="4453"/>
+        <w:jc w:val="start"/>
+        <w:rPr>
+          <w:b/>
+          <w:bCs/>
+          <w:sz w:val="24"/>
+          <w:szCs w:val="24"/>
+        </w:rPr>
+      </w:pPr>
+      <w:r>
+        <w:rPr>
+          <w:b/>
+          <w:bCs/>
+          <w:sz w:val="24"/>
+          <w:szCs w:val="24"/>
+        </w:rPr>
+        <w:t>Company</w:t>
+      </w:r>
+      <w:r>
+        <w:rPr/>
+        <w:tab/>
+      </w:r>
+      <w:r>
+        <w:rPr>
+          <w:b/>
+          <w:bCs/>
+          <w:sz w:val="24"/>
+          <w:szCs w:val="24"/>
+        </w:rPr>
+        <w:t>: AL Muslim Washing Ltd.</w:t>
+      </w:r>
+    </w:p>
+    <w:p>
+      <w:pPr>
+        <w:pStyle w:val="BodyText"/>
+        <w:widowControl w:val="false"/>
+        <w:tabs>
+          <w:tab w:val="clear" w:pos="720"/>
+          <w:tab w:val="left" w:pos="2179" w:leader="none"/>
+        </w:tabs>
+        <w:bidi w:val="0"/>
+        <w:spacing w:lineRule="auto" w:line="415" w:beforeAutospacing="0" w:before="0" w:after="0"/>
+        <w:ind w:hanging="0" w:start="0" w:end="3420"/>
+        <w:jc w:val="start"/>
+        <w:rPr/>
+      </w:pPr>
+      <w:r>
+        <w:rPr/>
+        <w:t>Department</w:t>
+        <w:tab/>
+        <w:t>: Initial Sample</w:t>
+      </w:r>
+    </w:p>
+    <w:p>
+      <w:pPr>
+        <w:pStyle w:val="BodyText"/>
+        <w:widowControl w:val="false"/>
+        <w:tabs>
+          <w:tab w:val="clear" w:pos="720"/>
+          <w:tab w:val="left" w:pos="2179" w:leader="none"/>
+        </w:tabs>
+        <w:bidi w:val="0"/>
+        <w:spacing w:lineRule="auto" w:line="415" w:beforeAutospacing="0" w:before="0" w:after="0"/>
+        <w:ind w:hanging="0" w:start="0" w:end="3420"/>
+        <w:jc w:val="start"/>
+        <w:rPr/>
+      </w:pPr>
+      <w:r>
+        <w:rPr/>
+        <w:t>Designation</w:t>
+        <w:tab/>
+        <w:t>: Sr. Operator</w:t>
+      </w:r>
+    </w:p>
+    <w:p>
+      <w:pPr>
+        <w:pStyle w:val="BodyText"/>
+        <w:widowControl w:val="false"/>
+        <w:tabs>
+          <w:tab w:val="clear" w:pos="720"/>
+          <w:tab w:val="left" w:pos="2179" w:leader="none"/>
+        </w:tabs>
+        <w:bidi w:val="0"/>
+        <w:spacing w:lineRule="auto" w:line="415" w:beforeAutospacing="0" w:before="0" w:after="0"/>
+        <w:ind w:hanging="0" w:start="0" w:end="3420"/>
+        <w:jc w:val="start"/>
+        <w:rPr/>
+      </w:pPr>
+      <w:r>
+        <w:rPr/>
+        <w:t>Duration</w:t>
+        <w:tab/>
+        <w:t xml:space="preserve">: 3 Years </w:t>
+      </w:r>
+      <w:r>
+        <w:rPr/>
+        <w:t xml:space="preserve">6 </w:t>
+      </w:r>
+      <w:r>
+        <w:rPr/>
+        <w:t>Months</w:t>
       </w:r>
     </w:p>
     <w:p>
@@ -751,7 +852,11 @@
       </w:r>
       <w:r>
         <w:rPr/>
-        <w:t>2 Years</w:t>
+        <w:t>1</w:t>
+      </w:r>
+      <w:r>
+        <w:rPr/>
+        <w:t xml:space="preserve"> Years till now</w:t>
       </w:r>
     </w:p>
     <w:p>
@@ -772,105 +877,7 @@
         </w:rPr>
       </w:pPr>
       <w:r>
-        <w:rPr>
-          <w:b/>
-          <w:bCs/>
-          <w:sz w:val="24"/>
-          <w:szCs w:val="24"/>
-        </w:rPr>
-        <w:t>Company</w:t>
-      </w:r>
-      <w:r>
-        <w:rPr/>
-        <w:tab/>
-      </w:r>
-      <w:r>
-        <w:rPr>
-          <w:b/>
-          <w:bCs/>
-          <w:sz w:val="24"/>
-          <w:szCs w:val="24"/>
-        </w:rPr>
-        <w:t>: AL Muslim Washing Ltd.</w:t>
-      </w:r>
-    </w:p>
-    <w:p>
-      <w:pPr>
-        <w:pStyle w:val="BodyText"/>
-        <w:widowControl w:val="false"/>
-        <w:tabs>
-          <w:tab w:val="clear" w:pos="720"/>
-          <w:tab w:val="left" w:pos="2179" w:leader="none"/>
-        </w:tabs>
-        <w:bidi w:val="0"/>
-        <w:spacing w:lineRule="auto" w:line="415" w:beforeAutospacing="0" w:before="0" w:after="0"/>
-        <w:ind w:hanging="0" w:start="0" w:end="3420"/>
-        <w:jc w:val="start"/>
-        <w:rPr/>
-      </w:pPr>
-      <w:r>
-        <w:rPr/>
-        <w:t>Department</w:t>
-        <w:tab/>
-        <w:t>: Initial Sample</w:t>
-      </w:r>
-    </w:p>
-    <w:p>
-      <w:pPr>
-        <w:pStyle w:val="BodyText"/>
-        <w:widowControl w:val="false"/>
-        <w:tabs>
-          <w:tab w:val="clear" w:pos="720"/>
-          <w:tab w:val="left" w:pos="2179" w:leader="none"/>
-        </w:tabs>
-        <w:bidi w:val="0"/>
-        <w:spacing w:lineRule="auto" w:line="415" w:beforeAutospacing="0" w:before="0" w:after="0"/>
-        <w:ind w:hanging="0" w:start="0" w:end="3420"/>
-        <w:jc w:val="start"/>
-        <w:rPr/>
-      </w:pPr>
-      <w:r>
-        <w:rPr/>
-        <w:t>Designation</w:t>
-        <w:tab/>
-        <w:t xml:space="preserve">: </w:t>
-      </w:r>
-      <w:r>
-        <w:rPr/>
-        <w:t>Supervisor</w:t>
-      </w:r>
-    </w:p>
-    <w:p>
-      <w:pPr>
-        <w:pStyle w:val="BodyText"/>
-        <w:widowControl w:val="false"/>
-        <w:tabs>
-          <w:tab w:val="clear" w:pos="720"/>
-          <w:tab w:val="left" w:pos="2179" w:leader="none"/>
-        </w:tabs>
-        <w:bidi w:val="0"/>
-        <w:spacing w:lineRule="auto" w:line="415" w:beforeAutospacing="0" w:before="0" w:after="0"/>
-        <w:ind w:hanging="0" w:start="0" w:end="3420"/>
-        <w:jc w:val="start"/>
-        <w:rPr/>
-      </w:pPr>
-      <w:r>
-        <w:rPr/>
-        <w:t>Duration</w:t>
-        <w:tab/>
-        <w:t xml:space="preserve">: </w:t>
-      </w:r>
-      <w:r>
-        <w:rPr/>
-        <w:t>3</w:t>
-      </w:r>
-      <w:r>
-        <w:rPr/>
-        <w:t xml:space="preserve"> Years </w:t>
-      </w:r>
-      <w:r>
-        <w:rPr/>
-        <w:t>till now</w:t>
+        <w:rPr/>
       </w:r>
     </w:p>
     <w:p>
@@ -1208,48 +1215,6 @@
           <w:sz w:val="24"/>
           <w:szCs w:val="24"/>
         </w:rPr>
-      </w:pPr>
-      <w:r>
-        <w:rPr>
-          <w:sz w:val="24"/>
-          <w:szCs w:val="24"/>
-        </w:rPr>
-        <w:t>MS</w:t>
-      </w:r>
-      <w:r>
-        <w:rPr>
-          <w:spacing w:val="-4"/>
-          <w:sz w:val="24"/>
-          <w:szCs w:val="24"/>
-        </w:rPr>
-        <w:t xml:space="preserve"> </w:t>
-      </w:r>
-      <w:r>
-        <w:rPr>
-          <w:sz w:val="24"/>
-          <w:szCs w:val="24"/>
-        </w:rPr>
-        <w:t>Excel. MS</w:t>
-      </w:r>
-      <w:r>
-        <w:rPr>
-          <w:spacing w:val="2"/>
-          <w:sz w:val="24"/>
-          <w:szCs w:val="24"/>
-        </w:rPr>
-        <w:t xml:space="preserve"> </w:t>
-      </w:r>
-      <w:r>
-        <w:rPr>
-          <w:spacing w:val="-4"/>
-          <w:sz w:val="24"/>
-          <w:szCs w:val="24"/>
-        </w:rPr>
-        <w:t>Word</w:t>
-      </w:r>
-    </w:p>
-    <w:p>
-      <w:pPr>
         <w:sectPr>
           <w:type w:val="nextPage"/>
           <w:pgSz w:w="11906" w:h="16838"/>
@@ -1257,8 +1222,47 @@
           <w:pgNumType w:fmt="decimal"/>
           <w:formProt w:val="false"/>
           <w:textDirection w:val="lrTb"/>
+          <w:docGrid w:type="default" w:linePitch="100" w:charSpace="0"/>
         </w:sectPr>
       </w:pPr>
+      <w:r>
+        <w:rPr>
+          <w:sz w:val="24"/>
+          <w:szCs w:val="24"/>
+        </w:rPr>
+        <w:t>MS</w:t>
+      </w:r>
+      <w:r>
+        <w:rPr>
+          <w:spacing w:val="-4"/>
+          <w:sz w:val="24"/>
+          <w:szCs w:val="24"/>
+        </w:rPr>
+        <w:t xml:space="preserve"> </w:t>
+      </w:r>
+      <w:r>
+        <w:rPr>
+          <w:sz w:val="24"/>
+          <w:szCs w:val="24"/>
+        </w:rPr>
+        <w:t>Excel. MS</w:t>
+      </w:r>
+      <w:r>
+        <w:rPr>
+          <w:spacing w:val="2"/>
+          <w:sz w:val="24"/>
+          <w:szCs w:val="24"/>
+        </w:rPr>
+        <w:t xml:space="preserve"> </w:t>
+      </w:r>
+      <w:r>
+        <w:rPr>
+          <w:spacing w:val="-4"/>
+          <w:sz w:val="24"/>
+          <w:szCs w:val="24"/>
+        </w:rPr>
+        <w:t>Word</w:t>
+      </w:r>
     </w:p>
     <w:p>
       <w:pPr>
@@ -2282,7 +2286,7 @@
     <w:p>
       <w:pPr>
         <w:pStyle w:val="Heading2"/>
-        <w:ind w:hanging="0" w:start="0"/>
+        <w:ind w:hanging="0" w:start="0" w:end="0"/>
         <w:rPr/>
       </w:pPr>
       <w:r>
@@ -3433,6 +3437,7 @@
     <w:qFormat/>
     <w:pPr>
       <w:widowControl w:val="false"/>
+      <w:suppressAutoHyphens w:val="true"/>
       <w:bidi w:val="0"/>
       <w:spacing w:lineRule="auto" w:line="240" w:before="0" w:after="0"/>
       <w:ind w:start="0" w:end="0"/>

</xml_diff>